<commit_message>
Project descriptions updated here
</commit_message>
<xml_diff>
--- a/AI Infra-Projects/Access-Resources-Required.docx
+++ b/AI Infra-Projects/Access-Resources-Required.docx
@@ -4,17 +4,88 @@
   <w:body>
     <w:p>
       <w:pPr>
-        <w:rPr>
-          <w:b/>
-          <w:bCs/>
-        </w:rPr>
-      </w:pPr>
-      <w:r>
-        <w:rPr>
-          <w:b/>
-          <w:bCs/>
-        </w:rPr>
-        <w:t>Access you need — and one thing to do </w:t>
+        <w:pStyle w:val="Heading2"/>
+      </w:pPr>
+      <w:r>
+        <w:t>Projects &amp; their overview descriptions by Claud:</w:t>
+      </w:r>
+    </w:p>
+    <w:p>
+      <w:pPr>
+        <w:rPr>
+          <w:b/>
+          <w:bCs/>
+        </w:rPr>
+      </w:pPr>
+      <w:r>
+        <w:rPr>
+          <w:b/>
+          <w:bCs/>
+        </w:rPr>
+        <w:t xml:space="preserve">Foundation (project-1 through 6) — uniformly strong, no duplicates, keep all six. These are the best-constructed files in the repo: real Terraform/YAML/Python, honest cost lines, current versions (EKS 1.31, Karpenter v1 API, vLLM v0.8.5), and each </w:t>
+      </w:r>
+      <w:proofErr w:type="gramStart"/>
+      <w:r>
+        <w:rPr>
+          <w:b/>
+          <w:bCs/>
+        </w:rPr>
+        <w:t>ends</w:t>
+      </w:r>
+      <w:proofErr w:type="gramEnd"/>
+      <w:r>
+        <w:rPr>
+          <w:b/>
+          <w:bCs/>
+        </w:rPr>
+        <w:t xml:space="preserve"> with resume bullets and whiteboard prompts. P6 (the ModelDeployment CRD + kopf operator with Kyverno, Envoy Gateway, OpenCost, burn-rate SLOs) is the standout of the entire repo — it maps almost verbatim to the Cisco Control Plane JD and it's genuinely buildable. P3 is the heaviest (Strimzi→Spark→Iceberg→Airflow→Trino) and the best Python workout. Two small currency notes: P2 and P6 pin vllm/vllm-</w:t>
+      </w:r>
+      <w:proofErr w:type="gramStart"/>
+      <w:r>
+        <w:rPr>
+          <w:b/>
+          <w:bCs/>
+        </w:rPr>
+        <w:t>openai:v</w:t>
+      </w:r>
+      <w:proofErr w:type="gramEnd"/>
+      <w:r>
+        <w:rPr>
+          <w:b/>
+          <w:bCs/>
+        </w:rPr>
+        <w:t xml:space="preserve">0.8.5 and P5 uses </w:t>
+      </w:r>
+      <w:proofErr w:type="gramStart"/>
+      <w:r>
+        <w:rPr>
+          <w:b/>
+          <w:bCs/>
+        </w:rPr>
+        <w:t>torch.cuda.amp.GradScaler</w:t>
+      </w:r>
+      <w:proofErr w:type="gramEnd"/>
+      <w:r>
+        <w:rPr>
+          <w:b/>
+          <w:bCs/>
+        </w:rPr>
+        <w:t xml:space="preserve"> — both have drifted (vLLM is well past that, and the AMP spelling is deprecated, which project-16 actually calls out). Nothing structural; just re-pin before building.</w:t>
+      </w:r>
+    </w:p>
+    <w:p>
+      <w:pPr>
+        <w:rPr>
+          <w:b/>
+          <w:bCs/>
+        </w:rPr>
+      </w:pPr>
+      <w:r>
+        <w:rPr>
+          <w:b/>
+          <w:bCs/>
+        </w:rPr>
+        <w:t xml:space="preserve">The GPU-scheduling pair — project-7-gpu-batch-scheduling vs project-07-topology-aware-gang-scheduler. These aren't redundant, they're complementary, and the resume value is having </w:t>
       </w:r>
       <w:r>
         <w:rPr>
@@ -23,6 +94,384 @@
           <w:i/>
           <w:iCs/>
         </w:rPr>
+        <w:t>both verbs</w:t>
+      </w:r>
+      <w:r>
+        <w:rPr>
+          <w:b/>
+          <w:bCs/>
+        </w:rPr>
+        <w:t xml:space="preserve">: the Set-A file </w:t>
+      </w:r>
+      <w:r>
+        <w:rPr>
+          <w:b/>
+          <w:bCs/>
+          <w:i/>
+          <w:iCs/>
+        </w:rPr>
+        <w:t>operates</w:t>
+      </w:r>
+      <w:r>
+        <w:rPr>
+          <w:b/>
+          <w:bCs/>
+        </w:rPr>
+        <w:t xml:space="preserve"> schedulers (Kueue cohorts/borrowing, Volcano DRF/binpack, DRA, a fragmentation analyzer), the Set-B file </w:t>
+      </w:r>
+      <w:r>
+        <w:rPr>
+          <w:b/>
+          <w:bCs/>
+          <w:i/>
+          <w:iCs/>
+        </w:rPr>
+        <w:t>builds</w:t>
+      </w:r>
+      <w:r>
+        <w:rPr>
+          <w:b/>
+          <w:bCs/>
+        </w:rPr>
+        <w:t xml:space="preserve"> one (a custom Go kube-scheduler plugin, kwok'd to 1,000 fake nodes). Keep both but renumber cleanly (e.g. 7a "operate" / 7b "build") and cross-link them. The Go one uniquely satisfies the Cisco AI-Control-Plane "Golang + scheduler internals" ask.</w:t>
+      </w:r>
+    </w:p>
+    <w:p>
+      <w:pPr>
+        <w:rPr>
+          <w:b/>
+          <w:bCs/>
+        </w:rPr>
+      </w:pPr>
+      <w:r>
+        <w:rPr>
+          <w:b/>
+          <w:bCs/>
+        </w:rPr>
+        <w:t xml:space="preserve">The fractional-GPU pair — project-8-gpu-sharing-partitioning-fleet vs project-08-fractional-gpu-dra-multitenancy. Heavy overlap (both are MIG + DRA + KAI). Merge into one. Set A has HAMi + MPS + the cost-per-tenant economics table, which Set B lacks; Set B has deeper DRA/CEL and the vCluster angle. Take A as the spine, graft B's DRA depth in. Good news from your </w:t>
+      </w:r>
+      <w:proofErr w:type="gramStart"/>
+      <w:r>
+        <w:rPr>
+          <w:b/>
+          <w:bCs/>
+        </w:rPr>
+        <w:t>resources</w:t>
+      </w:r>
+      <w:proofErr w:type="gramEnd"/>
+      <w:r>
+        <w:rPr>
+          <w:b/>
+          <w:bCs/>
+        </w:rPr>
+        <w:t xml:space="preserve"> doc: it already correctly notes MIG needs a non-AWS A100 and that the merged P08 dropped the p4d trap — that awareness is exactly right.</w:t>
+      </w:r>
+    </w:p>
+    <w:p>
+      <w:pPr>
+        <w:rPr>
+          <w:b/>
+          <w:bCs/>
+        </w:rPr>
+      </w:pPr>
+      <w:r>
+        <w:rPr>
+          <w:b/>
+          <w:bCs/>
+        </w:rPr>
+        <w:t>The advanced-inference pair — project-10-advanced-inference-gateway vs project-09-disaggregated-inference-llm-d. Same topic (Gateway API Inference Extension, multi-LoRA, prefix cache, P/D disaggregation). Merge to one. Both carry the same version-drift risk: vLLM's --speculative-model is now --speculative-config JSON, and dynamic LoRA loading needs VLLM_ALLOW_RUNTIME_LORA_UPDATING=True. Fix once in the merged file.</w:t>
+      </w:r>
+    </w:p>
+    <w:p>
+      <w:pPr>
+        <w:rPr>
+          <w:b/>
+          <w:bCs/>
+        </w:rPr>
+      </w:pPr>
+      <w:r>
+        <w:rPr>
+          <w:b/>
+          <w:bCs/>
+        </w:rPr>
+        <w:t>The AIOps pair — project-11-aiops-observability-platform vs project-12-ai-fleet-sre-finops-aiops. Same topic (LGTM + anomaly detection + predictive GPU failure + LLM RCA agent + burn-rate SLOs). Merge to one. One real bug to fix in the merge: the anomaly detector's comment says "IsolationForest on residuals" but the code fits raw values, so it'll flag ordinary daily seasonality as anomalous — either detrend first or change the description.</w:t>
+      </w:r>
+    </w:p>
+    <w:p>
+      <w:pPr>
+        <w:rPr>
+          <w:b/>
+          <w:bCs/>
+        </w:rPr>
+      </w:pPr>
+      <w:r>
+        <w:rPr>
+          <w:b/>
+          <w:bCs/>
+        </w:rPr>
+        <w:t>The genuinely unique advanced files — keep all, they're gap-fillers:</w:t>
+      </w:r>
+    </w:p>
+    <w:p>
+      <w:pPr>
+        <w:numPr>
+          <w:ilvl w:val="0"/>
+          <w:numId w:val="3"/>
+        </w:numPr>
+        <w:rPr>
+          <w:b/>
+          <w:bCs/>
+        </w:rPr>
+      </w:pPr>
+      <w:r>
+        <w:rPr>
+          <w:b/>
+          <w:bCs/>
+        </w:rPr>
+        <w:t>project-11-petabyte-data-feature-platform (Iceberg REST catalog, Flink exactly-once CDC, Celeborn shuffle, Feast, lineage) — this is the advanced data platform the Set-A track dropped entirely despite the Big Data book. Reinstate it; it's the strongest data artifact you have.</w:t>
+      </w:r>
+    </w:p>
+    <w:p>
+      <w:pPr>
+        <w:numPr>
+          <w:ilvl w:val="0"/>
+          <w:numId w:val="3"/>
+        </w:numPr>
+        <w:rPr>
+          <w:b/>
+          <w:bCs/>
+        </w:rPr>
+      </w:pPr>
+      <w:r>
+        <w:rPr>
+          <w:b/>
+          <w:bCs/>
+        </w:rPr>
+        <w:t xml:space="preserve">project-10-fault-tolerant-training-goodput (elastic torchrun, async hierarchical checkpointing, XID-driven remediation, goodput/MFU math, the Llama-3 466-interruptions framing) — training </w:t>
+      </w:r>
+      <w:r>
+        <w:rPr>
+          <w:b/>
+          <w:bCs/>
+          <w:i/>
+          <w:iCs/>
+        </w:rPr>
+        <w:t>reliability</w:t>
+      </w:r>
+      <w:r>
+        <w:rPr>
+          <w:b/>
+          <w:bCs/>
+        </w:rPr>
+        <w:t xml:space="preserve"> as its own project. At frontier labs this is a hireable specialty; nothing else in the repo covers it.</w:t>
+      </w:r>
+    </w:p>
+    <w:p>
+      <w:pPr>
+        <w:numPr>
+          <w:ilvl w:val="0"/>
+          <w:numId w:val="3"/>
+        </w:numPr>
+        <w:rPr>
+          <w:b/>
+          <w:bCs/>
+        </w:rPr>
+      </w:pPr>
+      <w:r>
+        <w:rPr>
+          <w:b/>
+          <w:bCs/>
+        </w:rPr>
+        <w:lastRenderedPageBreak/>
+        <w:t>project-12-multicluster-global-platform (CAPI, ApplicationSets, Cluster Mesh, MultiKueue, a real DR drill) — the only file hitting the Staff/fleet JD. Keep.</w:t>
+      </w:r>
+    </w:p>
+    <w:p>
+      <w:pPr>
+        <w:numPr>
+          <w:ilvl w:val="0"/>
+          <w:numId w:val="3"/>
+        </w:numPr>
+        <w:rPr>
+          <w:b/>
+          <w:bCs/>
+        </w:rPr>
+      </w:pPr>
+      <w:r>
+        <w:rPr>
+          <w:b/>
+          <w:bCs/>
+        </w:rPr>
+        <w:t>project-15-nvidia-ai-factory-reference (GPU Operator validator, NIM tenancy on MIG, NeMo loop, BOM in DGX/SuperPOD terms) — the capstone reference architecture. One correction to make before you build it: Phase 2 says "re-run P9's nccl-tests with the Network Operator managing the RDMA stack." The NVIDIA Network Operator manages Mellanox/ConnectX NICs and OFED — it does not manage EFA, which is Amazon's proprietary libfabric/SRD fabric. On EKS/g-family that phase can't run as written. The file already hedges ("do it as an architecture + GDS write-up on non-RDMA hardware"), so just cut the "re-run P9" line and keep the design-note framing.</w:t>
+      </w:r>
+    </w:p>
+    <w:p>
+      <w:pPr>
+        <w:rPr>
+          <w:b/>
+          <w:bCs/>
+        </w:rPr>
+      </w:pPr>
+      <w:r>
+        <w:rPr>
+          <w:b/>
+          <w:bCs/>
+        </w:rPr>
+        <w:t>NVIDIA — the CUDA situation and the rest:</w:t>
+      </w:r>
+    </w:p>
+    <w:p>
+      <w:pPr>
+        <w:numPr>
+          <w:ilvl w:val="0"/>
+          <w:numId w:val="4"/>
+        </w:numPr>
+        <w:rPr>
+          <w:b/>
+          <w:bCs/>
+        </w:rPr>
+      </w:pPr>
+      <w:r>
+        <w:rPr>
+          <w:b/>
+          <w:bCs/>
+        </w:rPr>
+        <w:t xml:space="preserve">project-16-cuda-gpu-performance-engineering is the best single file in the whole repo, and it strictly supersedes the older project-13-cuda-gpu-performance-engineering (Set A). Delete the old one. The dense-vs-sparse peak-FLOPS section, the ridge-point math, MFU vs HFU with the PaLM-paper convention, and the analytic roofline on your own vecadd kernel are more rigorous than most professional infra engineers could write. One caution before you post its headline publicly: the A10G "70 dense / 140 sparse, and the 125 figure is really the A10" claim is a </w:t>
+      </w:r>
+      <w:r>
+        <w:rPr>
+          <w:b/>
+          <w:bCs/>
+          <w:i/>
+          <w:iCs/>
+        </w:rPr>
+        <w:t>confident public correction</w:t>
+      </w:r>
+      <w:r>
+        <w:rPr>
+          <w:b/>
+          <w:bCs/>
+        </w:rPr>
+        <w:t xml:space="preserve">, and third-party sources genuinely disagree on the A10G's exact tensor number. Verify it against NVIDIA's own A10G product page first — a correction that's itself slightly off would backfire on exactly the audience you're trying to impress. The dense-vs-sparse </w:t>
+      </w:r>
+      <w:r>
+        <w:rPr>
+          <w:b/>
+          <w:bCs/>
+          <w:i/>
+          <w:iCs/>
+        </w:rPr>
+        <w:t>principle</w:t>
+      </w:r>
+      <w:r>
+        <w:rPr>
+          <w:b/>
+          <w:bCs/>
+        </w:rPr>
+        <w:t xml:space="preserve"> is unassailable regardless.</w:t>
+      </w:r>
+    </w:p>
+    <w:p>
+      <w:pPr>
+        <w:numPr>
+          <w:ilvl w:val="0"/>
+          <w:numId w:val="4"/>
+        </w:numPr>
+        <w:rPr>
+          <w:b/>
+          <w:bCs/>
+        </w:rPr>
+      </w:pPr>
+      <w:r>
+        <w:rPr>
+          <w:b/>
+          <w:bCs/>
+        </w:rPr>
+        <w:t>project-13-nvidia-tensorrt-llm-triton-factory (Set B) vs project-14-nvidia-inference-stack (Set A) overlap on Triton/TRT-LLM/NIM/Dynamo. B is deeper on the engine-build factory + CI/canary; A adds NIM and model-analyzer. Merge, keeping B as spine — but swap model-analyzer for genai-perf, which is what NVIDIA's own LLM docs now push for LLM serving.</w:t>
+      </w:r>
+    </w:p>
+    <w:p>
+      <w:pPr>
+        <w:numPr>
+          <w:ilvl w:val="0"/>
+          <w:numId w:val="4"/>
+        </w:numPr>
+        <w:rPr>
+          <w:b/>
+          <w:bCs/>
+        </w:rPr>
+      </w:pPr>
+      <w:r>
+        <w:rPr>
+          <w:b/>
+          <w:bCs/>
+        </w:rPr>
+        <w:t>project-14-nvidia-dynamo-inference-os (Set B) is the full Dynamo treatment and correctly warns the CRDs move fast; keep it as the standalone Dynamo project (Set A's P14 only covers Dynamo as one phase).</w:t>
+      </w:r>
+    </w:p>
+    <w:p>
+      <w:pPr>
+        <w:numPr>
+          <w:ilvl w:val="0"/>
+          <w:numId w:val="4"/>
+        </w:numPr>
+        <w:rPr>
+          <w:b/>
+          <w:bCs/>
+        </w:rPr>
+      </w:pPr>
+      <w:r>
+        <w:rPr>
+          <w:b/>
+          <w:bCs/>
+        </w:rPr>
+        <w:t xml:space="preserve">project-15-nvidia-networking-nccl-cluster-validation (Set B, EFA/GPUDirect/NCCL busbw ladders + acceptance suite) is distinct from the training-focused project-9-multinode-training-nccl-efa (Set A) — the former is cluster bring-up/validation, the latter is FSDP/DeepSpeed </w:t>
+      </w:r>
+      <w:r>
+        <w:rPr>
+          <w:b/>
+          <w:bCs/>
+          <w:i/>
+          <w:iCs/>
+        </w:rPr>
+        <w:t>over</w:t>
+      </w:r>
+      <w:r>
+        <w:rPr>
+          <w:b/>
+          <w:bCs/>
+        </w:rPr>
+        <w:t xml:space="preserve"> the fabric. Keep both.</w:t>
+      </w:r>
+    </w:p>
+    <w:p>
+      <w:pPr>
+        <w:rPr>
+          <w:b/>
+          <w:bCs/>
+        </w:rPr>
+      </w:pPr>
+    </w:p>
+    <w:p>
+      <w:pPr>
+        <w:rPr>
+          <w:b/>
+          <w:bCs/>
+        </w:rPr>
+      </w:pPr>
+    </w:p>
+    <w:p>
+      <w:pPr>
+        <w:pStyle w:val="Heading2"/>
+      </w:pPr>
+      <w:r>
+        <w:t>Access you need — and one thing to do </w:t>
+      </w:r>
+      <w:r>
+        <w:rPr>
+          <w:i/>
+          <w:iCs/>
+        </w:rPr>
         <w:t>today</w:t>
       </w:r>
     </w:p>
@@ -51,7 +500,15 @@
     </w:p>
     <w:p>
       <w:r>
-        <w:t xml:space="preserve">On a fresh or GPU-unused AWS account, your quota for G and P instances is 0 vCPUs. You cannot launch a single g5.xlarge. Increases are human-reviewed and take </w:t>
+        <w:t>On a fresh or GPU-unused AWS account, your quota for G and P instances is 0 vCPUs. You cannot launch a single g</w:t>
+      </w:r>
+      <w:proofErr w:type="gramStart"/>
+      <w:r>
+        <w:t>5.xlarge</w:t>
+      </w:r>
+      <w:proofErr w:type="gramEnd"/>
+      <w:r>
+        <w:t xml:space="preserve">. Increases are human-reviewed and take </w:t>
       </w:r>
       <w:r>
         <w:rPr>
@@ -155,6 +612,7 @@
                 <w:b/>
                 <w:bCs/>
               </w:rPr>
+              <w:lastRenderedPageBreak/>
               <w:t>Quota</w:t>
             </w:r>
           </w:p>
@@ -925,8 +1383,13 @@
       </w:r>
     </w:p>
     <w:p>
-      <w:r>
-        <w:t xml:space="preserve">So for P08 you need </w:t>
+      <w:proofErr w:type="gramStart"/>
+      <w:r>
+        <w:t>So</w:t>
+      </w:r>
+      <w:proofErr w:type="gramEnd"/>
+      <w:r>
+        <w:t xml:space="preserve"> for P08 you need </w:t>
       </w:r>
       <w:r>
         <w:rPr>
@@ -997,7 +1460,6 @@
                 <w:b/>
                 <w:bCs/>
               </w:rPr>
-              <w:lastRenderedPageBreak/>
               <w:t>Option</w:t>
             </w:r>
           </w:p>
@@ -1345,6 +1807,7 @@
     </w:tbl>
     <w:p>
       <w:r>
+        <w:lastRenderedPageBreak/>
         <w:t>Same A100-SXM4-40GB silicon as a p4d, so mig-manager, the nvidia.com/mig.config label, mixed geometries, and DCGM per-slice metrics behave identically. Two to three hours of rental covers the whole phase.</w:t>
       </w:r>
     </w:p>
@@ -1571,9 +2034,9 @@
 <file path=word/numbering.xml><?xml version="1.0" encoding="utf-8"?>
 <w:numbering xmlns:wpc="http://schemas.microsoft.com/office/word/2010/wordprocessingCanvas" xmlns:cx="http://schemas.microsoft.com/office/drawing/2014/chartex" xmlns:cx1="http://schemas.microsoft.com/office/drawing/2015/9/8/chartex" xmlns:cx2="http://schemas.microsoft.com/office/drawing/2015/10/21/chartex" xmlns:cx3="http://schemas.microsoft.com/office/drawing/2016/5/9/chartex" xmlns:cx4="http://schemas.microsoft.com/office/drawing/2016/5/10/chartex" xmlns:cx5="http://schemas.microsoft.com/office/drawing/2016/5/11/chartex" xmlns:cx6="http://schemas.microsoft.com/office/drawing/2016/5/12/chartex" xmlns:cx7="http://schemas.microsoft.com/office/drawing/2016/5/13/chartex" xmlns:cx8="http://schemas.microsoft.com/office/drawing/2016/5/14/chartex" xmlns:mc="http://schemas.openxmlformats.org/markup-compatibility/2006" xmlns:aink="http://schemas.microsoft.com/office/drawing/2016/ink" xmlns:am3d="http://schemas.microsoft.com/office/drawing/2017/model3d" xmlns:o="urn:schemas-microsoft-com:office:office" xmlns:oel="http://schemas.microsoft.com/office/2019/extlst" xmlns:r="http://schemas.openxmlformats.org/officeDocument/2006/relationships" xmlns:m="http://schemas.openxmlformats.org/officeDocument/2006/math" xmlns:v="urn:schemas-microsoft-com:vml" xmlns:wp14="http://schemas.microsoft.com/office/word/2010/wordprocessingDrawing" xmlns:wp="http://schemas.openxmlformats.org/drawingml/2006/wordprocessingDrawing" xmlns:w10="urn:schemas-microsoft-com:office:word" xmlns:w="http://schemas.openxmlformats.org/wordprocessingml/2006/main" xmlns:w14="http://schemas.microsoft.com/office/word/2010/wordml" xmlns:w15="http://schemas.microsoft.com/office/word/2012/wordml" xmlns:w16cex="http://schemas.microsoft.com/office/word/2018/wordml/cex" xmlns:w16cid="http://schemas.microsoft.com/office/word/2016/wordml/cid" xmlns:w16="http://schemas.microsoft.com/office/word/2018/wordml" xmlns:w16du="http://schemas.microsoft.com/office/word/2023/wordml/word16du" xmlns:w16sdtdh="http://schemas.microsoft.com/office/word/2020/wordml/sdtdatahash" xmlns:w16sdtfl="http://schemas.microsoft.com/office/word/2024/wordml/sdtformatlock" xmlns:w16se="http://schemas.microsoft.com/office/word/2015/wordml/symex" xmlns:wpg="http://schemas.microsoft.com/office/word/2010/wordprocessingGroup" xmlns:wpi="http://schemas.microsoft.com/office/word/2010/wordprocessingInk" xmlns:wne="http://schemas.microsoft.com/office/word/2006/wordml" xmlns:wps="http://schemas.microsoft.com/office/word/2010/wordprocessingShape" mc:Ignorable="w14 w15 w16se w16cid w16 w16cex w16sdtdh w16sdtfl w16du wp14">
   <w:abstractNum w:abstractNumId="0" w15:restartNumberingAfterBreak="0">
-    <w:nsid w:val="4C867307"/>
+    <w:nsid w:val="2E430998"/>
     <w:multiLevelType w:val="multilevel"/>
-    <w:tmpl w:val="64A68B36"/>
+    <w:tmpl w:val="87183180"/>
     <w:lvl w:ilvl="0">
       <w:start w:val="1"/>
       <w:numFmt w:val="bullet"/>
@@ -1720,9 +2183,9 @@
     </w:lvl>
   </w:abstractNum>
   <w:abstractNum w:abstractNumId="1" w15:restartNumberingAfterBreak="0">
-    <w:nsid w:val="6A1B4A6B"/>
+    <w:nsid w:val="4C867307"/>
     <w:multiLevelType w:val="multilevel"/>
-    <w:tmpl w:val="5EE86AAE"/>
+    <w:tmpl w:val="64A68B36"/>
     <w:lvl w:ilvl="0">
       <w:start w:val="1"/>
       <w:numFmt w:val="bullet"/>
@@ -1868,11 +2331,315 @@
       </w:rPr>
     </w:lvl>
   </w:abstractNum>
+  <w:abstractNum w:abstractNumId="2" w15:restartNumberingAfterBreak="0">
+    <w:nsid w:val="5E326764"/>
+    <w:multiLevelType w:val="multilevel"/>
+    <w:tmpl w:val="6928AF5A"/>
+    <w:lvl w:ilvl="0">
+      <w:start w:val="1"/>
+      <w:numFmt w:val="bullet"/>
+      <w:lvlText w:val=""/>
+      <w:lvlJc w:val="left"/>
+      <w:pPr>
+        <w:tabs>
+          <w:tab w:val="num" w:pos="720"/>
+        </w:tabs>
+        <w:ind w:left="720" w:hanging="360"/>
+      </w:pPr>
+      <w:rPr>
+        <w:rFonts w:ascii="Symbol" w:hAnsi="Symbol" w:hint="default"/>
+        <w:sz w:val="20"/>
+      </w:rPr>
+    </w:lvl>
+    <w:lvl w:ilvl="1" w:tentative="1">
+      <w:start w:val="1"/>
+      <w:numFmt w:val="bullet"/>
+      <w:lvlText w:val="o"/>
+      <w:lvlJc w:val="left"/>
+      <w:pPr>
+        <w:tabs>
+          <w:tab w:val="num" w:pos="1440"/>
+        </w:tabs>
+        <w:ind w:left="1440" w:hanging="360"/>
+      </w:pPr>
+      <w:rPr>
+        <w:rFonts w:ascii="Courier New" w:hAnsi="Courier New" w:hint="default"/>
+        <w:sz w:val="20"/>
+      </w:rPr>
+    </w:lvl>
+    <w:lvl w:ilvl="2" w:tentative="1">
+      <w:start w:val="1"/>
+      <w:numFmt w:val="bullet"/>
+      <w:lvlText w:val=""/>
+      <w:lvlJc w:val="left"/>
+      <w:pPr>
+        <w:tabs>
+          <w:tab w:val="num" w:pos="2160"/>
+        </w:tabs>
+        <w:ind w:left="2160" w:hanging="360"/>
+      </w:pPr>
+      <w:rPr>
+        <w:rFonts w:ascii="Wingdings" w:hAnsi="Wingdings" w:hint="default"/>
+        <w:sz w:val="20"/>
+      </w:rPr>
+    </w:lvl>
+    <w:lvl w:ilvl="3" w:tentative="1">
+      <w:start w:val="1"/>
+      <w:numFmt w:val="bullet"/>
+      <w:lvlText w:val=""/>
+      <w:lvlJc w:val="left"/>
+      <w:pPr>
+        <w:tabs>
+          <w:tab w:val="num" w:pos="2880"/>
+        </w:tabs>
+        <w:ind w:left="2880" w:hanging="360"/>
+      </w:pPr>
+      <w:rPr>
+        <w:rFonts w:ascii="Wingdings" w:hAnsi="Wingdings" w:hint="default"/>
+        <w:sz w:val="20"/>
+      </w:rPr>
+    </w:lvl>
+    <w:lvl w:ilvl="4" w:tentative="1">
+      <w:start w:val="1"/>
+      <w:numFmt w:val="bullet"/>
+      <w:lvlText w:val=""/>
+      <w:lvlJc w:val="left"/>
+      <w:pPr>
+        <w:tabs>
+          <w:tab w:val="num" w:pos="3600"/>
+        </w:tabs>
+        <w:ind w:left="3600" w:hanging="360"/>
+      </w:pPr>
+      <w:rPr>
+        <w:rFonts w:ascii="Wingdings" w:hAnsi="Wingdings" w:hint="default"/>
+        <w:sz w:val="20"/>
+      </w:rPr>
+    </w:lvl>
+    <w:lvl w:ilvl="5" w:tentative="1">
+      <w:start w:val="1"/>
+      <w:numFmt w:val="bullet"/>
+      <w:lvlText w:val=""/>
+      <w:lvlJc w:val="left"/>
+      <w:pPr>
+        <w:tabs>
+          <w:tab w:val="num" w:pos="4320"/>
+        </w:tabs>
+        <w:ind w:left="4320" w:hanging="360"/>
+      </w:pPr>
+      <w:rPr>
+        <w:rFonts w:ascii="Wingdings" w:hAnsi="Wingdings" w:hint="default"/>
+        <w:sz w:val="20"/>
+      </w:rPr>
+    </w:lvl>
+    <w:lvl w:ilvl="6" w:tentative="1">
+      <w:start w:val="1"/>
+      <w:numFmt w:val="bullet"/>
+      <w:lvlText w:val=""/>
+      <w:lvlJc w:val="left"/>
+      <w:pPr>
+        <w:tabs>
+          <w:tab w:val="num" w:pos="5040"/>
+        </w:tabs>
+        <w:ind w:left="5040" w:hanging="360"/>
+      </w:pPr>
+      <w:rPr>
+        <w:rFonts w:ascii="Wingdings" w:hAnsi="Wingdings" w:hint="default"/>
+        <w:sz w:val="20"/>
+      </w:rPr>
+    </w:lvl>
+    <w:lvl w:ilvl="7" w:tentative="1">
+      <w:start w:val="1"/>
+      <w:numFmt w:val="bullet"/>
+      <w:lvlText w:val=""/>
+      <w:lvlJc w:val="left"/>
+      <w:pPr>
+        <w:tabs>
+          <w:tab w:val="num" w:pos="5760"/>
+        </w:tabs>
+        <w:ind w:left="5760" w:hanging="360"/>
+      </w:pPr>
+      <w:rPr>
+        <w:rFonts w:ascii="Wingdings" w:hAnsi="Wingdings" w:hint="default"/>
+        <w:sz w:val="20"/>
+      </w:rPr>
+    </w:lvl>
+    <w:lvl w:ilvl="8" w:tentative="1">
+      <w:start w:val="1"/>
+      <w:numFmt w:val="bullet"/>
+      <w:lvlText w:val=""/>
+      <w:lvlJc w:val="left"/>
+      <w:pPr>
+        <w:tabs>
+          <w:tab w:val="num" w:pos="6480"/>
+        </w:tabs>
+        <w:ind w:left="6480" w:hanging="360"/>
+      </w:pPr>
+      <w:rPr>
+        <w:rFonts w:ascii="Wingdings" w:hAnsi="Wingdings" w:hint="default"/>
+        <w:sz w:val="20"/>
+      </w:rPr>
+    </w:lvl>
+  </w:abstractNum>
+  <w:abstractNum w:abstractNumId="3" w15:restartNumberingAfterBreak="0">
+    <w:nsid w:val="6A1B4A6B"/>
+    <w:multiLevelType w:val="multilevel"/>
+    <w:tmpl w:val="5EE86AAE"/>
+    <w:lvl w:ilvl="0">
+      <w:start w:val="1"/>
+      <w:numFmt w:val="bullet"/>
+      <w:lvlText w:val=""/>
+      <w:lvlJc w:val="left"/>
+      <w:pPr>
+        <w:tabs>
+          <w:tab w:val="num" w:pos="720"/>
+        </w:tabs>
+        <w:ind w:left="720" w:hanging="360"/>
+      </w:pPr>
+      <w:rPr>
+        <w:rFonts w:ascii="Symbol" w:hAnsi="Symbol" w:hint="default"/>
+        <w:sz w:val="20"/>
+      </w:rPr>
+    </w:lvl>
+    <w:lvl w:ilvl="1" w:tentative="1">
+      <w:start w:val="1"/>
+      <w:numFmt w:val="bullet"/>
+      <w:lvlText w:val="o"/>
+      <w:lvlJc w:val="left"/>
+      <w:pPr>
+        <w:tabs>
+          <w:tab w:val="num" w:pos="1440"/>
+        </w:tabs>
+        <w:ind w:left="1440" w:hanging="360"/>
+      </w:pPr>
+      <w:rPr>
+        <w:rFonts w:ascii="Courier New" w:hAnsi="Courier New" w:hint="default"/>
+        <w:sz w:val="20"/>
+      </w:rPr>
+    </w:lvl>
+    <w:lvl w:ilvl="2" w:tentative="1">
+      <w:start w:val="1"/>
+      <w:numFmt w:val="bullet"/>
+      <w:lvlText w:val=""/>
+      <w:lvlJc w:val="left"/>
+      <w:pPr>
+        <w:tabs>
+          <w:tab w:val="num" w:pos="2160"/>
+        </w:tabs>
+        <w:ind w:left="2160" w:hanging="360"/>
+      </w:pPr>
+      <w:rPr>
+        <w:rFonts w:ascii="Wingdings" w:hAnsi="Wingdings" w:hint="default"/>
+        <w:sz w:val="20"/>
+      </w:rPr>
+    </w:lvl>
+    <w:lvl w:ilvl="3" w:tentative="1">
+      <w:start w:val="1"/>
+      <w:numFmt w:val="bullet"/>
+      <w:lvlText w:val=""/>
+      <w:lvlJc w:val="left"/>
+      <w:pPr>
+        <w:tabs>
+          <w:tab w:val="num" w:pos="2880"/>
+        </w:tabs>
+        <w:ind w:left="2880" w:hanging="360"/>
+      </w:pPr>
+      <w:rPr>
+        <w:rFonts w:ascii="Wingdings" w:hAnsi="Wingdings" w:hint="default"/>
+        <w:sz w:val="20"/>
+      </w:rPr>
+    </w:lvl>
+    <w:lvl w:ilvl="4" w:tentative="1">
+      <w:start w:val="1"/>
+      <w:numFmt w:val="bullet"/>
+      <w:lvlText w:val=""/>
+      <w:lvlJc w:val="left"/>
+      <w:pPr>
+        <w:tabs>
+          <w:tab w:val="num" w:pos="3600"/>
+        </w:tabs>
+        <w:ind w:left="3600" w:hanging="360"/>
+      </w:pPr>
+      <w:rPr>
+        <w:rFonts w:ascii="Wingdings" w:hAnsi="Wingdings" w:hint="default"/>
+        <w:sz w:val="20"/>
+      </w:rPr>
+    </w:lvl>
+    <w:lvl w:ilvl="5" w:tentative="1">
+      <w:start w:val="1"/>
+      <w:numFmt w:val="bullet"/>
+      <w:lvlText w:val=""/>
+      <w:lvlJc w:val="left"/>
+      <w:pPr>
+        <w:tabs>
+          <w:tab w:val="num" w:pos="4320"/>
+        </w:tabs>
+        <w:ind w:left="4320" w:hanging="360"/>
+      </w:pPr>
+      <w:rPr>
+        <w:rFonts w:ascii="Wingdings" w:hAnsi="Wingdings" w:hint="default"/>
+        <w:sz w:val="20"/>
+      </w:rPr>
+    </w:lvl>
+    <w:lvl w:ilvl="6" w:tentative="1">
+      <w:start w:val="1"/>
+      <w:numFmt w:val="bullet"/>
+      <w:lvlText w:val=""/>
+      <w:lvlJc w:val="left"/>
+      <w:pPr>
+        <w:tabs>
+          <w:tab w:val="num" w:pos="5040"/>
+        </w:tabs>
+        <w:ind w:left="5040" w:hanging="360"/>
+      </w:pPr>
+      <w:rPr>
+        <w:rFonts w:ascii="Wingdings" w:hAnsi="Wingdings" w:hint="default"/>
+        <w:sz w:val="20"/>
+      </w:rPr>
+    </w:lvl>
+    <w:lvl w:ilvl="7" w:tentative="1">
+      <w:start w:val="1"/>
+      <w:numFmt w:val="bullet"/>
+      <w:lvlText w:val=""/>
+      <w:lvlJc w:val="left"/>
+      <w:pPr>
+        <w:tabs>
+          <w:tab w:val="num" w:pos="5760"/>
+        </w:tabs>
+        <w:ind w:left="5760" w:hanging="360"/>
+      </w:pPr>
+      <w:rPr>
+        <w:rFonts w:ascii="Wingdings" w:hAnsi="Wingdings" w:hint="default"/>
+        <w:sz w:val="20"/>
+      </w:rPr>
+    </w:lvl>
+    <w:lvl w:ilvl="8" w:tentative="1">
+      <w:start w:val="1"/>
+      <w:numFmt w:val="bullet"/>
+      <w:lvlText w:val=""/>
+      <w:lvlJc w:val="left"/>
+      <w:pPr>
+        <w:tabs>
+          <w:tab w:val="num" w:pos="6480"/>
+        </w:tabs>
+        <w:ind w:left="6480" w:hanging="360"/>
+      </w:pPr>
+      <w:rPr>
+        <w:rFonts w:ascii="Wingdings" w:hAnsi="Wingdings" w:hint="default"/>
+        <w:sz w:val="20"/>
+      </w:rPr>
+    </w:lvl>
+  </w:abstractNum>
   <w:num w:numId="1" w16cid:durableId="433673517">
-    <w:abstractNumId w:val="0"/>
+    <w:abstractNumId w:val="1"/>
   </w:num>
   <w:num w:numId="2" w16cid:durableId="223609359">
-    <w:abstractNumId w:val="1"/>
+    <w:abstractNumId w:val="3"/>
+  </w:num>
+  <w:num w:numId="3" w16cid:durableId="1659309064">
+    <w:abstractNumId w:val="2"/>
+  </w:num>
+  <w:num w:numId="4" w16cid:durableId="1162744245">
+    <w:abstractNumId w:val="0"/>
   </w:num>
 </w:numbering>
 </file>
@@ -2305,7 +3072,6 @@
     <w:next w:val="Normal"/>
     <w:link w:val="Heading2Char"/>
     <w:uiPriority w:val="9"/>
-    <w:semiHidden/>
     <w:unhideWhenUsed/>
     <w:qFormat/>
     <w:rsid w:val="005076AE"/>
@@ -2521,7 +3287,6 @@
     <w:basedOn w:val="DefaultParagraphFont"/>
     <w:link w:val="Heading2"/>
     <w:uiPriority w:val="9"/>
-    <w:semiHidden/>
     <w:rsid w:val="005076AE"/>
     <w:rPr>
       <w:rFonts w:asciiTheme="majorHAnsi" w:eastAsiaTheme="majorEastAsia" w:hAnsiTheme="majorHAnsi" w:cstheme="majorBidi"/>

</xml_diff>